<commit_message>
Update resume and portfolio changes
</commit_message>
<xml_diff>
--- a/public/Resume.docx
+++ b/public/Resume.docx
@@ -43,6 +43,12 @@
         </w:pBdr>
         <w:spacing w:after="160"/>
         <w:jc w:val="center"/>
+        <w:rPr>
+          <w:rFonts w:ascii="Calibri" w:eastAsia="Calibri" w:hAnsi="Calibri" w:cs="Calibri"/>
+          <w:color w:val="333333"/>
+          <w:sz w:val="19"/>
+          <w:szCs w:val="19"/>
+        </w:rPr>
       </w:pPr>
       <w:hyperlink r:id="rId5" w:history="1">
         <w:r>
@@ -52,25 +58,7 @@
             <w:sz w:val="19"/>
             <w:szCs w:val="19"/>
           </w:rPr>
-          <w:t>Lin</w:t>
-        </w:r>
-        <w:r>
-          <w:rPr>
-            <w:rStyle w:val="Hyperlink"/>
-            <w:rFonts w:ascii="Calibri" w:eastAsia="Calibri" w:hAnsi="Calibri" w:cs="Calibri"/>
-            <w:sz w:val="19"/>
-            <w:szCs w:val="19"/>
-          </w:rPr>
-          <w:t>k</w:t>
-        </w:r>
-        <w:r>
-          <w:rPr>
-            <w:rStyle w:val="Hyperlink"/>
-            <w:rFonts w:ascii="Calibri" w:eastAsia="Calibri" w:hAnsi="Calibri" w:cs="Calibri"/>
-            <w:sz w:val="19"/>
-            <w:szCs w:val="19"/>
-          </w:rPr>
-          <w:t>edIn</w:t>
+          <w:t>LinkedIn</w:t>
         </w:r>
       </w:hyperlink>
       <w:r>
@@ -102,7 +90,17 @@
         </w:rPr>
         <w:t xml:space="preserve">  |  </w:t>
       </w:r>
-      <w:proofErr w:type="gramStart"/>
+      <w:hyperlink r:id="rId7" w:history="1">
+        <w:r>
+          <w:rPr>
+            <w:rStyle w:val="Hyperlink"/>
+            <w:rFonts w:ascii="Calibri" w:eastAsia="Calibri" w:hAnsi="Calibri" w:cs="Calibri"/>
+            <w:sz w:val="19"/>
+            <w:szCs w:val="19"/>
+          </w:rPr>
+          <w:t>Portfolio</w:t>
+        </w:r>
+      </w:hyperlink>
       <w:r>
         <w:rPr>
           <w:rFonts w:ascii="Calibri" w:eastAsia="Calibri" w:hAnsi="Calibri" w:cs="Calibri"/>
@@ -110,7 +108,7 @@
           <w:sz w:val="19"/>
           <w:szCs w:val="19"/>
         </w:rPr>
-        <w:t>d</w:t>
+        <w:t xml:space="preserve">  |  </w:t>
       </w:r>
       <w:r>
         <w:rPr>
@@ -119,7 +117,7 @@
           <w:sz w:val="19"/>
           <w:szCs w:val="19"/>
         </w:rPr>
-        <w:t>haranik5126</w:t>
+        <w:t>d</w:t>
       </w:r>
       <w:r>
         <w:rPr>
@@ -128,9 +126,8 @@
           <w:sz w:val="19"/>
           <w:szCs w:val="19"/>
         </w:rPr>
-        <w:t>@gmail.com  |</w:t>
-      </w:r>
-      <w:proofErr w:type="gramEnd"/>
+        <w:t>haranik5126</w:t>
+      </w:r>
       <w:r>
         <w:rPr>
           <w:rFonts w:ascii="Calibri" w:eastAsia="Calibri" w:hAnsi="Calibri" w:cs="Calibri"/>
@@ -138,7 +135,7 @@
           <w:sz w:val="19"/>
           <w:szCs w:val="19"/>
         </w:rPr>
-        <w:t xml:space="preserve">  +91 8870489169</w:t>
+        <w:t>@gmail.com  |  +91 8870489169</w:t>
       </w:r>
     </w:p>
     <w:p>
@@ -287,23 +284,7 @@
           <w:rFonts w:ascii="Calibri" w:eastAsia="Calibri" w:hAnsi="Calibri" w:cs="Calibri"/>
           <w:color w:val="333333"/>
         </w:rPr>
-        <w:t xml:space="preserve">DevOps &amp; Tools: Git, GitHub, Postman, </w:t>
-      </w:r>
-      <w:proofErr w:type="spellStart"/>
-      <w:r>
-        <w:rPr>
-          <w:rFonts w:ascii="Calibri" w:eastAsia="Calibri" w:hAnsi="Calibri" w:cs="Calibri"/>
-          <w:color w:val="333333"/>
-        </w:rPr>
-        <w:t>Vercel</w:t>
-      </w:r>
-      <w:proofErr w:type="spellEnd"/>
-      <w:r>
-        <w:rPr>
-          <w:rFonts w:ascii="Calibri" w:eastAsia="Calibri" w:hAnsi="Calibri" w:cs="Calibri"/>
-          <w:color w:val="333333"/>
-        </w:rPr>
-        <w:t>, Render, Firebase</w:t>
+        <w:t>DevOps &amp; Tools: Git, GitHub, Postman, Vercel, Render, Firebase</w:t>
       </w:r>
     </w:p>
     <w:p>
@@ -423,23 +404,7 @@
           <w:rFonts w:ascii="Calibri" w:eastAsia="Calibri" w:hAnsi="Calibri" w:cs="Calibri"/>
           <w:color w:val="333333"/>
         </w:rPr>
-        <w:t xml:space="preserve">Deployed the frontend on </w:t>
-      </w:r>
-      <w:proofErr w:type="spellStart"/>
-      <w:r>
-        <w:rPr>
-          <w:rFonts w:ascii="Calibri" w:eastAsia="Calibri" w:hAnsi="Calibri" w:cs="Calibri"/>
-          <w:color w:val="333333"/>
-        </w:rPr>
-        <w:t>Vercel</w:t>
-      </w:r>
-      <w:proofErr w:type="spellEnd"/>
-      <w:r>
-        <w:rPr>
-          <w:rFonts w:ascii="Calibri" w:eastAsia="Calibri" w:hAnsi="Calibri" w:cs="Calibri"/>
-          <w:color w:val="333333"/>
-        </w:rPr>
-        <w:t xml:space="preserve"> and backend on Render, with MongoDB Atlas for cloud database hosting.</w:t>
+        <w:t>Deployed the frontend on Vercel and backend on Render, with MongoDB Atlas for cloud database hosting.</w:t>
       </w:r>
     </w:p>
     <w:p>
@@ -472,56 +437,24 @@
           <w:rFonts w:ascii="Calibri" w:eastAsia="Calibri" w:hAnsi="Calibri" w:cs="Calibri"/>
           <w:color w:val="333333"/>
         </w:rPr>
-        <w:t xml:space="preserve">Developed a responsive weather dashboard using React.js and </w:t>
-      </w:r>
-      <w:proofErr w:type="spellStart"/>
-      <w:r>
-        <w:rPr>
-          <w:rFonts w:ascii="Calibri" w:eastAsia="Calibri" w:hAnsi="Calibri" w:cs="Calibri"/>
-          <w:color w:val="333333"/>
-        </w:rPr>
-        <w:t>OpenWeatherMap</w:t>
-      </w:r>
-      <w:proofErr w:type="spellEnd"/>
-      <w:r>
-        <w:rPr>
-          <w:rFonts w:ascii="Calibri" w:eastAsia="Calibri" w:hAnsi="Calibri" w:cs="Calibri"/>
-          <w:color w:val="333333"/>
-        </w:rPr>
-        <w:t xml:space="preserve"> API.</w:t>
-      </w:r>
-    </w:p>
-    <w:p>
-      <w:pPr>
-        <w:pStyle w:val="ListParagraph"/>
-        <w:numPr>
-          <w:ilvl w:val="0"/>
-          <w:numId w:val="2"/>
-        </w:numPr>
-        <w:spacing w:after="40"/>
-      </w:pPr>
-      <w:r>
-        <w:rPr>
-          <w:rFonts w:ascii="Calibri" w:eastAsia="Calibri" w:hAnsi="Calibri" w:cs="Calibri"/>
-          <w:color w:val="333333"/>
-        </w:rPr>
-        <w:t xml:space="preserve">Integrated the </w:t>
-      </w:r>
-      <w:proofErr w:type="spellStart"/>
-      <w:r>
-        <w:rPr>
-          <w:rFonts w:ascii="Calibri" w:eastAsia="Calibri" w:hAnsi="Calibri" w:cs="Calibri"/>
-          <w:color w:val="333333"/>
-        </w:rPr>
-        <w:t>OpenWeatherMap</w:t>
-      </w:r>
-      <w:proofErr w:type="spellEnd"/>
-      <w:r>
-        <w:rPr>
-          <w:rFonts w:ascii="Calibri" w:eastAsia="Calibri" w:hAnsi="Calibri" w:cs="Calibri"/>
-          <w:color w:val="333333"/>
-        </w:rPr>
-        <w:t xml:space="preserve"> API using Axios to retrieve real-time weather information.</w:t>
+        <w:t>Developed a responsive weather dashboard using React.js and OpenWeatherMap API.</w:t>
+      </w:r>
+    </w:p>
+    <w:p>
+      <w:pPr>
+        <w:pStyle w:val="ListParagraph"/>
+        <w:numPr>
+          <w:ilvl w:val="0"/>
+          <w:numId w:val="2"/>
+        </w:numPr>
+        <w:spacing w:after="40"/>
+      </w:pPr>
+      <w:r>
+        <w:rPr>
+          <w:rFonts w:ascii="Calibri" w:eastAsia="Calibri" w:hAnsi="Calibri" w:cs="Calibri"/>
+          <w:color w:val="333333"/>
+        </w:rPr>
+        <w:t>Integrated the OpenWeatherMap API using Axios to retrieve real-time weather information.</w:t>
       </w:r>
     </w:p>
     <w:p>
@@ -675,17 +608,8 @@
           <w:rFonts w:ascii="Calibri" w:eastAsia="Calibri" w:hAnsi="Calibri" w:cs="Calibri"/>
           <w:color w:val="333333"/>
         </w:rPr>
-        <w:t xml:space="preserve">UI/UX Software Development — </w:t>
-      </w:r>
-      <w:proofErr w:type="spellStart"/>
-      <w:r>
-        <w:rPr>
-          <w:rFonts w:ascii="Calibri" w:eastAsia="Calibri" w:hAnsi="Calibri" w:cs="Calibri"/>
-          <w:color w:val="333333"/>
-        </w:rPr>
-        <w:t>Vivartha</w:t>
-      </w:r>
-      <w:proofErr w:type="spellEnd"/>
+        <w:t>UI/UX Software Development — Vivartha</w:t>
+      </w:r>
     </w:p>
     <w:p>
       <w:pPr>
@@ -718,23 +642,7 @@
           <w:rFonts w:ascii="Calibri" w:eastAsia="Calibri" w:hAnsi="Calibri" w:cs="Calibri"/>
           <w:color w:val="333333"/>
         </w:rPr>
-        <w:t xml:space="preserve">Full-Stack Development — </w:t>
-      </w:r>
-      <w:proofErr w:type="spellStart"/>
-      <w:r>
-        <w:rPr>
-          <w:rFonts w:ascii="Calibri" w:eastAsia="Calibri" w:hAnsi="Calibri" w:cs="Calibri"/>
-          <w:color w:val="333333"/>
-        </w:rPr>
-        <w:t>Cognifyz</w:t>
-      </w:r>
-      <w:proofErr w:type="spellEnd"/>
-      <w:r>
-        <w:rPr>
-          <w:rFonts w:ascii="Calibri" w:eastAsia="Calibri" w:hAnsi="Calibri" w:cs="Calibri"/>
-          <w:color w:val="333333"/>
-        </w:rPr>
-        <w:t xml:space="preserve"> IT Solutions</w:t>
+        <w:t>Full-Stack Development — Cognifyz IT Solutions</w:t>
       </w:r>
     </w:p>
     <w:p>
@@ -826,6 +734,40 @@
     </w:p>
     <w:p>
       <w:pPr>
+        <w:pStyle w:val="ListParagraph"/>
+        <w:numPr>
+          <w:ilvl w:val="0"/>
+          <w:numId w:val="2"/>
+        </w:numPr>
+        <w:spacing w:after="40"/>
+      </w:pPr>
+      <w:r>
+        <w:rPr>
+          <w:rFonts w:ascii="Calibri" w:eastAsia="Calibri" w:hAnsi="Calibri" w:cs="Calibri"/>
+          <w:color w:val="333333"/>
+        </w:rPr>
+        <w:t>Python with Full Stack — Hitakey Tech Solution Pvt Ltd</w:t>
+      </w:r>
+    </w:p>
+    <w:p>
+      <w:pPr>
+        <w:pStyle w:val="ListParagraph"/>
+        <w:numPr>
+          <w:ilvl w:val="0"/>
+          <w:numId w:val="2"/>
+        </w:numPr>
+        <w:spacing w:after="40"/>
+      </w:pPr>
+      <w:r>
+        <w:rPr>
+          <w:rFonts w:ascii="Calibri" w:eastAsia="Calibri" w:hAnsi="Calibri" w:cs="Calibri"/>
+          <w:color w:val="333333"/>
+        </w:rPr>
+        <w:t>Two Day International Conference — ICETCSMA`25</w:t>
+      </w:r>
+    </w:p>
+    <w:p>
+      <w:pPr>
         <w:pBdr>
           <w:bottom w:val="single" w:sz="6" w:space="2" w:color="1F3864"/>
         </w:pBdr>
@@ -866,27 +808,11 @@
           <w:rFonts w:ascii="Calibri" w:eastAsia="Calibri" w:hAnsi="Calibri" w:cs="Calibri"/>
           <w:color w:val="555555"/>
         </w:rPr>
-        <w:t xml:space="preserve">NPR Arts and Science College, </w:t>
-      </w:r>
-      <w:proofErr w:type="gramStart"/>
-      <w:r>
-        <w:rPr>
-          <w:rFonts w:ascii="Calibri" w:eastAsia="Calibri" w:hAnsi="Calibri" w:cs="Calibri"/>
-          <w:color w:val="555555"/>
-        </w:rPr>
-        <w:t>Natham  |</w:t>
-      </w:r>
-      <w:proofErr w:type="gramEnd"/>
-      <w:r>
-        <w:rPr>
-          <w:rFonts w:ascii="Calibri" w:eastAsia="Calibri" w:hAnsi="Calibri" w:cs="Calibri"/>
-          <w:color w:val="555555"/>
-        </w:rPr>
-        <w:t xml:space="preserve">  2023 – 2026</w:t>
+        <w:t>NPR Arts and Science College, Natham  |  2023 – 2026</w:t>
       </w:r>
     </w:p>
     <w:sectPr>
-      <w:pgSz w:w="12240" w:h="15840"/>
+      <w:pgSz w:w="11906" w:h="16838" w:code="9"/>
       <w:pgMar w:top="600" w:right="900" w:bottom="600" w:left="900" w:header="708" w:footer="708" w:gutter="0"/>
       <w:cols w:space="720"/>
       <w:docGrid w:linePitch="360"/>

</xml_diff>